<commit_message>
fix total commits and mergeds
</commit_message>
<xml_diff>
--- a/docs/management/weekly/W4-status.docx
+++ b/docs/management/weekly/W4-status.docx
@@ -211,7 +211,7 @@
                         <pic:cNvPicPr preferRelativeResize="0"/>
                       </pic:nvPicPr>
                       <pic:blipFill>
-                        <a:blip r:embed="rId9"/>
+                        <a:blip r:embed="rId7"/>
                         <a:srcRect/>
                         <a:stretch>
                           <a:fillRect/>
@@ -438,7 +438,7 @@
                         <pic:cNvPicPr preferRelativeResize="0"/>
                       </pic:nvPicPr>
                       <pic:blipFill>
-                        <a:blip r:embed="rId9"/>
+                        <a:blip r:embed="rId7"/>
                         <a:srcRect/>
                         <a:stretch>
                           <a:fillRect/>
@@ -654,7 +654,7 @@
                     <pic:cNvPicPr preferRelativeResize="0"/>
                   </pic:nvPicPr>
                   <pic:blipFill>
-                    <a:blip r:embed="rId10"/>
+                    <a:blip r:embed="rId8"/>
                     <a:srcRect b="0" l="0" r="0" t="0"/>
                     <a:stretch>
                       <a:fillRect/>
@@ -884,7 +884,7 @@
                         <pic:cNvPicPr preferRelativeResize="0"/>
                       </pic:nvPicPr>
                       <pic:blipFill>
-                        <a:blip r:embed="rId9"/>
+                        <a:blip r:embed="rId7"/>
                         <a:srcRect/>
                         <a:stretch>
                           <a:fillRect/>
@@ -932,7 +932,7 @@
     </w:p>
     <w:sdt>
       <w:sdtPr>
-        <w:id w:val="1389246279"/>
+        <w:id w:val="-1420707979"/>
         <w:docPartObj>
           <w:docPartGallery w:val="Table of Contents"/>
           <w:docPartUnique w:val="1"/>
@@ -1382,8 +1382,8 @@
       <w:pPr>
         <w:rPr/>
         <w:sectPr>
-          <w:headerReference r:id="rId11" w:type="default"/>
-          <w:footerReference r:id="rId12" w:type="default"/>
+          <w:headerReference r:id="rId9" w:type="default"/>
+          <w:footerReference r:id="rId10" w:type="default"/>
           <w:type w:val="nextPage"/>
           <w:pgSz w:h="15840" w:w="12240" w:orient="portrait"/>
           <w:pgMar w:bottom="1440" w:top="1440" w:left="1440" w:right="1440" w:header="720" w:footer="720"/>
@@ -1602,8 +1602,8 @@
         <w:jc w:val="both"/>
         <w:rPr/>
         <w:sectPr>
-          <w:headerReference r:id="rId13" w:type="default"/>
-          <w:footerReference r:id="rId14" w:type="default"/>
+          <w:headerReference r:id="rId11" w:type="default"/>
+          <w:footerReference r:id="rId12" w:type="default"/>
           <w:type w:val="nextPage"/>
           <w:pgSz w:h="15840" w:w="12240" w:orient="portrait"/>
           <w:pgMar w:bottom="1080" w:top="1080" w:left="1080" w:right="1080" w:header="720" w:footer="720"/>
@@ -2216,7 +2216,7 @@
             </w:pPr>
             <w:sdt>
               <w:sdtPr>
-                <w:id w:val="240553939"/>
+                <w:id w:val="-1992908706"/>
                 <w:tag w:val="goog_rdk_0"/>
               </w:sdtPr>
               <w:sdtContent>
@@ -2907,7 +2907,7 @@
             </w:pPr>
             <w:sdt>
               <w:sdtPr>
-                <w:id w:val="1508652163"/>
+                <w:id w:val="247158508"/>
                 <w:tag w:val="goog_rdk_1"/>
               </w:sdtPr>
               <w:sdtContent>
@@ -3009,37 +3009,28 @@
               <w:jc w:val="left"/>
               <w:rPr/>
             </w:pPr>
+            <w:r>
+              <w:rPr>
+                <w:rtl w:val="0"/>
+              </w:rPr>
+              <w:t xml:space="preserve">W04-05 Review initial design goals and prepare the basic system architecture based on PA1 and the developing PA2 requirements.</w:t>
+            </w:r>
+          </w:p>
+        </w:tc>
+        <w:tc>
+          <w:tcPr>
+            <w:vAlign w:val="center"/>
+          </w:tcPr>
+          <w:p>
+            <w:pPr>
+              <w:spacing w:after="40" w:lineRule="auto"/>
+              <w:jc w:val="center"/>
+              <w:rPr/>
+            </w:pPr>
             <w:sdt>
               <w:sdtPr>
-                <w:id w:val="1288592110"/>
+                <w:id w:val="855792502"/>
                 <w:tag w:val="goog_rdk_2"/>
-              </w:sdtPr>
-              <w:sdtContent>
-                <w:commentRangeStart w:id="0"/>
-              </w:sdtContent>
-            </w:sdt>
-            <w:r>
-              <w:rPr>
-                <w:rtl w:val="0"/>
-              </w:rPr>
-              <w:t xml:space="preserve">W04-05 Review initial design goals and prepare the basic system architecture based on PA1 and the developing PA2 requirements.</w:t>
-            </w:r>
-          </w:p>
-        </w:tc>
-        <w:tc>
-          <w:tcPr>
-            <w:vAlign w:val="center"/>
-          </w:tcPr>
-          <w:p>
-            <w:pPr>
-              <w:spacing w:after="40" w:lineRule="auto"/>
-              <w:jc w:val="center"/>
-              <w:rPr/>
-            </w:pPr>
-            <w:sdt>
-              <w:sdtPr>
-                <w:id w:val="405786614"/>
-                <w:tag w:val="goog_rdk_3"/>
               </w:sdtPr>
               <w:sdtContent>
                 <w:r>
@@ -3138,41 +3129,28 @@
               <w:jc w:val="left"/>
               <w:rPr/>
             </w:pPr>
-            <w:commentRangeEnd w:id="0"/>
-            <w:r>
-              <w:commentReference w:id="0"/>
-            </w:r>
+            <w:r>
+              <w:rPr>
+                <w:rtl w:val="0"/>
+              </w:rPr>
+              <w:t xml:space="preserve">W04-06 Prepare the frontend, backend, and database development environments for the upcoming implementation phase.</w:t>
+            </w:r>
+          </w:p>
+        </w:tc>
+        <w:tc>
+          <w:tcPr>
+            <w:vAlign w:val="center"/>
+          </w:tcPr>
+          <w:p>
+            <w:pPr>
+              <w:spacing w:after="40" w:lineRule="auto"/>
+              <w:jc w:val="center"/>
+              <w:rPr/>
+            </w:pPr>
             <w:sdt>
               <w:sdtPr>
-                <w:id w:val="-1997122034"/>
-                <w:tag w:val="goog_rdk_4"/>
-              </w:sdtPr>
-              <w:sdtContent>
-                <w:commentRangeStart w:id="1"/>
-              </w:sdtContent>
-            </w:sdt>
-            <w:r>
-              <w:rPr>
-                <w:rtl w:val="0"/>
-              </w:rPr>
-              <w:t xml:space="preserve">W04-06 Prepare the frontend, backend, and database development environments for the upcoming implementation phase.</w:t>
-            </w:r>
-          </w:p>
-        </w:tc>
-        <w:tc>
-          <w:tcPr>
-            <w:vAlign w:val="center"/>
-          </w:tcPr>
-          <w:p>
-            <w:pPr>
-              <w:spacing w:after="40" w:lineRule="auto"/>
-              <w:jc w:val="center"/>
-              <w:rPr/>
-            </w:pPr>
-            <w:sdt>
-              <w:sdtPr>
-                <w:id w:val="-533496189"/>
-                <w:tag w:val="goog_rdk_5"/>
+                <w:id w:val="-357486666"/>
+                <w:tag w:val="goog_rdk_3"/>
               </w:sdtPr>
               <w:sdtContent>
                 <w:r>
@@ -3271,19 +3249,6 @@
               <w:jc w:val="left"/>
               <w:rPr/>
             </w:pPr>
-            <w:commentRangeEnd w:id="1"/>
-            <w:r>
-              <w:commentReference w:id="1"/>
-            </w:r>
-            <w:sdt>
-              <w:sdtPr>
-                <w:id w:val="301426445"/>
-                <w:tag w:val="goog_rdk_6"/>
-              </w:sdtPr>
-              <w:sdtContent>
-                <w:commentRangeStart w:id="2"/>
-              </w:sdtContent>
-            </w:sdt>
             <w:r>
               <w:rPr>
                 <w:rtl w:val="0"/>
@@ -3395,10 +3360,6 @@
               <w:jc w:val="left"/>
               <w:rPr/>
             </w:pPr>
-            <w:commentRangeEnd w:id="2"/>
-            <w:r>
-              <w:commentReference w:id="2"/>
-            </w:r>
             <w:r>
               <w:rPr>
                 <w:rtl w:val="0"/>
@@ -4277,8 +4238,8 @@
             </w:pPr>
             <w:sdt>
               <w:sdtPr>
-                <w:id w:val="-2042310288"/>
-                <w:tag w:val="goog_rdk_7"/>
+                <w:id w:val="1703341901"/>
+                <w:tag w:val="goog_rdk_4"/>
               </w:sdtPr>
               <w:sdtContent>
                 <w:r>
@@ -4769,8 +4730,8 @@
             </w:pPr>
             <w:sdt>
               <w:sdtPr>
-                <w:id w:val="311833814"/>
-                <w:tag w:val="goog_rdk_8"/>
+                <w:id w:val="1046350535"/>
+                <w:tag w:val="goog_rdk_5"/>
               </w:sdtPr>
               <w:sdtContent>
                 <w:r>
@@ -4873,8 +4834,8 @@
             </w:pPr>
             <w:sdt>
               <w:sdtPr>
-                <w:id w:val="-1157414342"/>
-                <w:tag w:val="goog_rdk_9"/>
+                <w:id w:val="-681669728"/>
+                <w:tag w:val="goog_rdk_6"/>
               </w:sdtPr>
               <w:sdtContent>
                 <w:r>
@@ -4978,8 +4939,8 @@
             </w:pPr>
             <w:sdt>
               <w:sdtPr>
-                <w:id w:val="2045694999"/>
-                <w:tag w:val="goog_rdk_10"/>
+                <w:id w:val="357658562"/>
+                <w:tag w:val="goog_rdk_7"/>
               </w:sdtPr>
               <w:sdtContent>
                 <w:r>
@@ -5082,8 +5043,8 @@
             </w:pPr>
             <w:sdt>
               <w:sdtPr>
-                <w:id w:val="981874016"/>
-                <w:tag w:val="goog_rdk_11"/>
+                <w:id w:val="123083057"/>
+                <w:tag w:val="goog_rdk_8"/>
               </w:sdtPr>
               <w:sdtContent>
                 <w:r>
@@ -5364,7 +5325,7 @@
               <w:rPr>
                 <w:rtl w:val="0"/>
               </w:rPr>
-              <w:t xml:space="preserve">7</w:t>
+              <w:t xml:space="preserve">8</w:t>
             </w:r>
           </w:p>
         </w:tc>
@@ -5380,7 +5341,7 @@
               <w:rPr>
                 <w:rtl w:val="0"/>
               </w:rPr>
-              <w:t xml:space="preserve">7</w:t>
+              <w:t xml:space="preserve">8</w:t>
             </w:r>
           </w:p>
         </w:tc>
@@ -5427,7 +5388,7 @@
               <w:rPr>
                 <w:rtl w:val="0"/>
               </w:rPr>
-              <w:t xml:space="preserve">3</w:t>
+              <w:t xml:space="preserve">2</w:t>
             </w:r>
           </w:p>
         </w:tc>
@@ -5443,7 +5404,7 @@
               <w:rPr>
                 <w:rtl w:val="0"/>
               </w:rPr>
-              <w:t xml:space="preserve">4</w:t>
+              <w:t xml:space="preserve">17</w:t>
             </w:r>
           </w:p>
         </w:tc>
@@ -5506,7 +5467,7 @@
               <w:rPr>
                 <w:rtl w:val="0"/>
               </w:rPr>
-              <w:t xml:space="preserve">1 merged</w:t>
+              <w:t xml:space="preserve">3 merged</w:t>
             </w:r>
           </w:p>
         </w:tc>
@@ -5590,184 +5551,6 @@
     </w:sectPr>
   </w:body>
 </w:document>
-</file>
-
-<file path=word/comments.xml><?xml version="1.0" encoding="utf-8"?>
-<w:comments xmlns:mc="http://schemas.openxmlformats.org/markup-compatibility/2006" xmlns:o="urn:schemas-microsoft-com:office:office" xmlns:r="http://schemas.openxmlformats.org/officeDocument/2006/relationships" xmlns:m="http://schemas.openxmlformats.org/officeDocument/2006/math" xmlns:v="urn:schemas-microsoft-com:vml" xmlns:wp="http://schemas.openxmlformats.org/drawingml/2006/wordprocessingDrawing" xmlns:w10="urn:schemas-microsoft-com:office:word" xmlns:w="http://schemas.openxmlformats.org/wordprocessingml/2006/main" xmlns:wne="http://schemas.microsoft.com/office/word/2006/wordml" xmlns:sl="http://schemas.openxmlformats.org/schemaLibrary/2006/main" xmlns:a="http://schemas.openxmlformats.org/drawingml/2006/main" xmlns:pic="http://schemas.openxmlformats.org/drawingml/2006/picture" xmlns:c="http://schemas.openxmlformats.org/drawingml/2006/chart" xmlns:lc="http://schemas.openxmlformats.org/drawingml/2006/lockedCanvas" xmlns:dgm="http://schemas.openxmlformats.org/drawingml/2006/diagram" xmlns:wps="http://schemas.microsoft.com/office/word/2010/wordprocessingShape" xmlns:wpg="http://schemas.microsoft.com/office/word/2010/wordprocessingGroup" xmlns:w14="http://schemas.microsoft.com/office/word/2010/wordml" xmlns:w15="http://schemas.microsoft.com/office/word/2012/wordml" xmlns:w16="http://schemas.microsoft.com/office/word/2018/wordml" xmlns:w16cex="http://schemas.microsoft.com/office/word/2018/wordml/cex" xmlns:w16cid="http://schemas.microsoft.com/office/word/2016/wordml/cid" xmlns="http://schemas.microsoft.com/office/tasks/2019/documenttasks" xmlns:cr="http://schemas.microsoft.com/office/comments/2020/reactions">
-  <w:comment w:author="Khoa Tran" w:id="2" w:date="2026-10-27T06:45:21Z">
-    <w:p>
-      <w:pPr>
-        <w:keepNext w:val="0"/>
-        <w:keepLines w:val="0"/>
-        <w:pageBreakBefore w:val="0"/>
-        <w:widowControl w:val="0"/>
-        <w:pBdr>
-          <w:top w:space="0" w:sz="0" w:val="nil"/>
-          <w:left w:space="0" w:sz="0" w:val="nil"/>
-          <w:bottom w:space="0" w:sz="0" w:val="nil"/>
-          <w:right w:space="0" w:sz="0" w:val="nil"/>
-          <w:between w:space="0" w:sz="0" w:val="nil"/>
-        </w:pBdr>
-        <w:shd w:fill="auto" w:val="clear"/>
-        <w:spacing w:after="0" w:before="0" w:line="240" w:lineRule="auto"/>
-        <w:ind w:left="0" w:right="0" w:firstLine="0"/>
-        <w:jc w:val="left"/>
-        <w:rPr>
-          <w:rFonts w:ascii="Arial" w:cs="Arial" w:eastAsia="Arial" w:hAnsi="Arial"/>
-          <w:b w:val="0"/>
-          <w:bCs w:val="0"/>
-          <w:i w:val="0"/>
-          <w:iCs w:val="0"/>
-          <w:smallCaps w:val="0"/>
-          <w:strike w:val="0"/>
-          <w:color w:val="000000"/>
-          <w:sz w:val="22"/>
-          <w:szCs w:val="22"/>
-          <w:u w:val="none"/>
-          <w:shd w:fill="auto" w:val="clear"/>
-          <w:vertAlign w:val="baseline"/>
-        </w:rPr>
-      </w:pPr>
-      <w:r>
-        <w:rPr>
-          <w:rFonts w:ascii="Arial" w:cs="Arial" w:eastAsia="Arial" w:hAnsi="Arial"/>
-          <w:b w:val="0"/>
-          <w:bCs w:val="0"/>
-          <w:i w:val="0"/>
-          <w:iCs w:val="0"/>
-          <w:smallCaps w:val="0"/>
-          <w:strike w:val="0"/>
-          <w:color w:val="000000"/>
-          <w:sz w:val="22"/>
-          <w:szCs w:val="22"/>
-          <w:u w:val="none"/>
-          <w:shd w:fill="auto" w:val="clear"/>
-          <w:vertAlign w:val="baseline"/>
-          <w:rtl w:val="0"/>
-        </w:rPr>
-        <w:t xml:space="preserve">i dont know</w:t>
-      </w:r>
-    </w:p>
-  </w:comment>
-  <w:comment w:author="Khoa Tran" w:id="0" w:date="2026-10-27T06:45:01Z">
-    <w:p>
-      <w:pPr>
-        <w:keepNext w:val="0"/>
-        <w:keepLines w:val="0"/>
-        <w:pageBreakBefore w:val="0"/>
-        <w:widowControl w:val="0"/>
-        <w:pBdr>
-          <w:top w:space="0" w:sz="0" w:val="nil"/>
-          <w:left w:space="0" w:sz="0" w:val="nil"/>
-          <w:bottom w:space="0" w:sz="0" w:val="nil"/>
-          <w:right w:space="0" w:sz="0" w:val="nil"/>
-          <w:between w:space="0" w:sz="0" w:val="nil"/>
-        </w:pBdr>
-        <w:shd w:fill="auto" w:val="clear"/>
-        <w:spacing w:after="0" w:before="0" w:line="240" w:lineRule="auto"/>
-        <w:ind w:left="0" w:right="0" w:firstLine="0"/>
-        <w:jc w:val="left"/>
-        <w:rPr>
-          <w:rFonts w:ascii="Arial" w:cs="Arial" w:eastAsia="Arial" w:hAnsi="Arial"/>
-          <w:b w:val="0"/>
-          <w:bCs w:val="0"/>
-          <w:i w:val="0"/>
-          <w:iCs w:val="0"/>
-          <w:smallCaps w:val="0"/>
-          <w:strike w:val="0"/>
-          <w:color w:val="000000"/>
-          <w:sz w:val="22"/>
-          <w:szCs w:val="22"/>
-          <w:u w:val="none"/>
-          <w:shd w:fill="auto" w:val="clear"/>
-          <w:vertAlign w:val="baseline"/>
-        </w:rPr>
-      </w:pPr>
-      <w:r>
-        <w:rPr>
-          <w:rFonts w:ascii="Arial" w:cs="Arial" w:eastAsia="Arial" w:hAnsi="Arial"/>
-          <w:b w:val="0"/>
-          <w:bCs w:val="0"/>
-          <w:i w:val="0"/>
-          <w:iCs w:val="0"/>
-          <w:smallCaps w:val="0"/>
-          <w:strike w:val="0"/>
-          <w:color w:val="000000"/>
-          <w:sz w:val="22"/>
-          <w:szCs w:val="22"/>
-          <w:u w:val="none"/>
-          <w:shd w:fill="auto" w:val="clear"/>
-          <w:vertAlign w:val="baseline"/>
-          <w:rtl w:val="0"/>
-        </w:rPr>
-        <w:t xml:space="preserve">2 cái task này, check lại nha mn, nếu oke thì giữ nguyên, nếu không thì sửa lại</w:t>
-      </w:r>
-    </w:p>
-  </w:comment>
-  <w:comment w:author="Khoa Tran" w:id="1" w:date="2026-10-27T06:45:01Z">
-    <w:p>
-      <w:pPr>
-        <w:keepNext w:val="0"/>
-        <w:keepLines w:val="0"/>
-        <w:pageBreakBefore w:val="0"/>
-        <w:widowControl w:val="0"/>
-        <w:pBdr>
-          <w:top w:space="0" w:sz="0" w:val="nil"/>
-          <w:left w:space="0" w:sz="0" w:val="nil"/>
-          <w:bottom w:space="0" w:sz="0" w:val="nil"/>
-          <w:right w:space="0" w:sz="0" w:val="nil"/>
-          <w:between w:space="0" w:sz="0" w:val="nil"/>
-        </w:pBdr>
-        <w:shd w:fill="auto" w:val="clear"/>
-        <w:spacing w:after="0" w:before="0" w:line="240" w:lineRule="auto"/>
-        <w:ind w:left="0" w:right="0" w:firstLine="0"/>
-        <w:jc w:val="left"/>
-        <w:rPr>
-          <w:rFonts w:ascii="Arial" w:cs="Arial" w:eastAsia="Arial" w:hAnsi="Arial"/>
-          <w:b w:val="0"/>
-          <w:bCs w:val="0"/>
-          <w:i w:val="0"/>
-          <w:iCs w:val="0"/>
-          <w:smallCaps w:val="0"/>
-          <w:strike w:val="0"/>
-          <w:color w:val="000000"/>
-          <w:sz w:val="22"/>
-          <w:szCs w:val="22"/>
-          <w:u w:val="none"/>
-          <w:shd w:fill="auto" w:val="clear"/>
-          <w:vertAlign w:val="baseline"/>
-        </w:rPr>
-      </w:pPr>
-      <w:r>
-        <w:rPr>
-          <w:rFonts w:ascii="Arial" w:cs="Arial" w:eastAsia="Arial" w:hAnsi="Arial"/>
-          <w:b w:val="0"/>
-          <w:bCs w:val="0"/>
-          <w:i w:val="0"/>
-          <w:iCs w:val="0"/>
-          <w:smallCaps w:val="0"/>
-          <w:strike w:val="0"/>
-          <w:color w:val="000000"/>
-          <w:sz w:val="22"/>
-          <w:szCs w:val="22"/>
-          <w:u w:val="none"/>
-          <w:shd w:fill="auto" w:val="clear"/>
-          <w:vertAlign w:val="baseline"/>
-          <w:rtl w:val="0"/>
-        </w:rPr>
-        <w:t xml:space="preserve">2 cái task này, check lại nha mn, nếu oke thì giữ nguyên, nếu không thì sửa lại</w:t>
-      </w:r>
-    </w:p>
-  </w:comment>
-</w:comments>
-</file>
-
-<file path=word/commentsExtended.xml><?xml version="1.0" encoding="utf-8"?>
-<w15:commentsEx xmlns:mc="http://schemas.openxmlformats.org/markup-compatibility/2006" xmlns:o="urn:schemas-microsoft-com:office:office" xmlns:r="http://schemas.openxmlformats.org/officeDocument/2006/relationships" xmlns:m="http://schemas.openxmlformats.org/officeDocument/2006/math" xmlns:v="urn:schemas-microsoft-com:vml" xmlns:wp="http://schemas.openxmlformats.org/drawingml/2006/wordprocessingDrawing" xmlns:w10="urn:schemas-microsoft-com:office:word" xmlns:w="http://schemas.openxmlformats.org/wordprocessingml/2006/main" xmlns:wne="http://schemas.microsoft.com/office/word/2006/wordml" xmlns:sl="http://schemas.openxmlformats.org/schemaLibrary/2006/main" xmlns:a="http://schemas.openxmlformats.org/drawingml/2006/main" xmlns:pic="http://schemas.openxmlformats.org/drawingml/2006/picture" xmlns:c="http://schemas.openxmlformats.org/drawingml/2006/chart" xmlns:lc="http://schemas.openxmlformats.org/drawingml/2006/lockedCanvas" xmlns:dgm="http://schemas.openxmlformats.org/drawingml/2006/diagram" xmlns:wps="http://schemas.microsoft.com/office/word/2010/wordprocessingShape" xmlns:wpg="http://schemas.microsoft.com/office/word/2010/wordprocessingGroup" xmlns:w14="http://schemas.microsoft.com/office/word/2010/wordml" xmlns:w15="http://schemas.microsoft.com/office/word/2012/wordml" xmlns:w16="http://schemas.microsoft.com/office/word/2018/wordml" xmlns:w16cex="http://schemas.microsoft.com/office/word/2018/wordml/cex" xmlns:w16cid="http://schemas.microsoft.com/office/word/2016/wordml/cid" xmlns="http://schemas.microsoft.com/office/tasks/2019/documenttasks" xmlns:cr="http://schemas.microsoft.com/office/comments/2020/reactions">
-  <w15:commentEx w15:paraId="000000E2" w15:done="0"/>
-  <w15:commentEx w15:paraId="000000E3" w15:done="0"/>
-  <w15:commentEx w15:paraId="000000E4" w15:done="0"/>
-</w15:commentsEx>
 </file>
 
 <file path=word/footer1.xml><?xml version="1.0" encoding="utf-8"?>
@@ -7905,7 +7688,7 @@
 
 <file path=customXML/item1.xml><?xml version="1.0" encoding="utf-8"?>
 <go:gDocsCustomXmlDataStorage xmlns:go="http://customooxmlschemas.google.com/" xmlns:r="http://schemas.openxmlformats.org/officeDocument/2006/relationships" uri="GoogleDocsCustomDataVersion2">
-  <go:docsCustomData xmlns:go="http://customooxmlschemas.google.com/" roundtripDataSignature="AMtx7mjse3rNEqEIWTvkBcx+h2fGFIn7MQ==">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</go:docsCustomData>
+  <go:docsCustomData xmlns:go="http://customooxmlschemas.google.com/" roundtripDataSignature="AMtx7mgygpKzr9BYgno5O9PrvyQ0bAIqrA==">CgMxLjAaEgoBMBINCgsIB0IHEgVBcmlhbBoSCgExEg0KCwgHQgcSBUFyaWFsGhIKATISDQoLCAdCBxIFQXJpYWwaEgoBMxINCgsIB0IHEgVBcmlhbBoSCgE0Eg0KCwgHQgcSBUFyaWFsGhIKATUSDQoLCAdCBxIFQXJpYWwaEgoBNhINCgsIB0IHEgVBcmlhbBoSCgE3Eg0KCwgHQgcSBUFyaWFsGhIKATgSDQoLCAdCBxIFQXJpYWwyDmguOGZ4cnllNmc2eHJuMg5oLnphcmY3YzhpNGR0ZTgAciExREd1Q2xDVVFmX0J2b29uT1JUX3FPVEM2ZHBlV2VYNXg=</go:docsCustomData>
 </go:gDocsCustomXmlDataStorage>
 </file>
 

</xml_diff>